<commit_message>
Let the memoria's figures flow under their headings
</commit_message>
<xml_diff>
--- a/docs/memoria/memoria_nobody_helps_from_the_corner.docx
+++ b/docs/memoria/memoria_nobody_helps_from_the_corner.docx
@@ -3192,7 +3192,7 @@
                 <w:sz w:val="19"/>
                 <w:szCs w:val="19"/>
               </w:rPr>
-              <w:t xml:space="preserve">46ff6a4</w:t>
+              <w:t xml:space="preserve">54f01cf</w:t>
             </w:r>
           </w:p>
         </w:tc>
@@ -3254,7 +3254,7 @@
                 <w:sz w:val="19"/>
                 <w:szCs w:val="19"/>
               </w:rPr>
-              <w:t xml:space="preserve">Draw the wind map and the man it leaves</w:t>
+              <w:t xml:space="preserve">Start the memoria, and correct a check that could not fail</w:t>
             </w:r>
           </w:p>
         </w:tc>
@@ -3287,7 +3287,7 @@
                 <w:sz w:val="19"/>
                 <w:szCs w:val="19"/>
               </w:rPr>
-              <w:t xml:space="preserve">ecc21a5</w:t>
+              <w:t xml:space="preserve">46ff6a4</w:t>
             </w:r>
           </w:p>
         </w:tc>
@@ -3349,7 +3349,7 @@
                 <w:sz w:val="19"/>
                 <w:szCs w:val="19"/>
               </w:rPr>
-              <w:t xml:space="preserve">Ship the interactive page of the rebound entry (P7.8)</w:t>
+              <w:t xml:space="preserve">Draw the wind map and the man it leaves</w:t>
             </w:r>
           </w:p>
         </w:tc>
@@ -3382,7 +3382,7 @@
                 <w:sz w:val="19"/>
                 <w:szCs w:val="19"/>
               </w:rPr>
-              <w:t xml:space="preserve">91e05ef</w:t>
+              <w:t xml:space="preserve">ecc21a5</w:t>
             </w:r>
           </w:p>
         </w:tc>
@@ -3444,7 +3444,7 @@
                 <w:sz w:val="19"/>
                 <w:szCs w:val="19"/>
               </w:rPr>
-              <w:t xml:space="preserve">Plan the second entry: nobody helps from the corner</w:t>
+              <w:t xml:space="preserve">Ship the interactive page of the rebound entry (P7.8)</w:t>
             </w:r>
           </w:p>
         </w:tc>
@@ -3477,7 +3477,7 @@
                 <w:sz w:val="19"/>
                 <w:szCs w:val="19"/>
               </w:rPr>
-              <w:t xml:space="preserve">8c5b430</w:t>
+              <w:t xml:space="preserve">91e05ef</w:t>
             </w:r>
           </w:p>
         </w:tc>
@@ -3539,7 +3539,7 @@
                 <w:sz w:val="19"/>
                 <w:szCs w:val="19"/>
               </w:rPr>
-              <w:t xml:space="preserve">Add the wind layer: who moves toward a drive, and who is left open</w:t>
+              <w:t xml:space="preserve">Plan the second entry: nobody helps from the corner</w:t>
             </w:r>
           </w:p>
         </w:tc>
@@ -3572,7 +3572,7 @@
                 <w:sz w:val="19"/>
                 <w:szCs w:val="19"/>
               </w:rPr>
-              <w:t xml:space="preserve">2217edc</w:t>
+              <w:t xml:space="preserve">8c5b430</w:t>
             </w:r>
           </w:p>
         </w:tc>
@@ -3603,7 +3603,7 @@
                 <w:sz w:val="19"/>
                 <w:szCs w:val="19"/>
               </w:rPr>
-              <w:t xml:space="preserve">2026-09-19</w:t>
+              <w:t xml:space="preserve">2026-10-28</w:t>
             </w:r>
           </w:p>
         </w:tc>
@@ -3634,7 +3634,7 @@
                 <w:sz w:val="19"/>
                 <w:szCs w:val="19"/>
               </w:rPr>
-              <w:t xml:space="preserve">Record two findings from the sibling project that touch this entry</w:t>
+              <w:t xml:space="preserve">Add the wind layer: who moves toward a drive, and who is left open</w:t>
             </w:r>
           </w:p>
         </w:tc>
@@ -3667,7 +3667,7 @@
                 <w:sz w:val="19"/>
                 <w:szCs w:val="19"/>
               </w:rPr>
-              <w:t xml:space="preserve">ce9b926</w:t>
+              <w:t xml:space="preserve">2217edc</w:t>
             </w:r>
           </w:p>
         </w:tc>
@@ -3729,7 +3729,7 @@
                 <w:sz w:val="19"/>
                 <w:szCs w:val="19"/>
               </w:rPr>
-              <w:t xml:space="preserve">Close the verification pass and write down what is left</w:t>
+              <w:t xml:space="preserve">Record two findings from the sibling project that touch this entry</w:t>
             </w:r>
           </w:p>
         </w:tc>
@@ -3762,7 +3762,7 @@
                 <w:sz w:val="19"/>
                 <w:szCs w:val="19"/>
               </w:rPr>
-              <w:t xml:space="preserve">eb61ef5</w:t>
+              <w:t xml:space="preserve">ce9b926</w:t>
             </w:r>
           </w:p>
         </w:tc>
@@ -3824,7 +3824,7 @@
                 <w:sz w:val="19"/>
                 <w:szCs w:val="19"/>
               </w:rPr>
-              <w:t xml:space="preserve">Close the cut at sixty seconds and read the length back from the file</w:t>
+              <w:t xml:space="preserve">Close the verification pass and write down what is left</w:t>
             </w:r>
           </w:p>
         </w:tc>
@@ -3857,7 +3857,7 @@
                 <w:sz w:val="19"/>
                 <w:szCs w:val="19"/>
               </w:rPr>
-              <w:t xml:space="preserve">85722c3</w:t>
+              <w:t xml:space="preserve">eb61ef5</w:t>
             </w:r>
           </w:p>
         </w:tc>
@@ -3919,7 +3919,7 @@
                 <w:sz w:val="19"/>
                 <w:szCs w:val="19"/>
               </w:rPr>
-              <w:t xml:space="preserve">Build the video: five slides and a silent cut timed to the script</w:t>
+              <w:t xml:space="preserve">Close the cut at sixty seconds and read the length back from the file</w:t>
             </w:r>
           </w:p>
         </w:tc>
@@ -11355,7 +11355,6 @@
     <w:p>
       <w:pPr>
         <w:pStyle w:val="Heading2"/>
-        <w:pageBreakBefore/>
       </w:pPr>
       <w:r>
         <w:t xml:space="preserve">9.2 Figura 2: el hombre que deja</w:t>

</xml_diff>